<commit_message>
Fixed Any trouble and create cheakpoint main1.py and mac1.py. Interaction between subscribers is correctly.
</commit_message>
<xml_diff>
--- a/MacaU/Search.docx
+++ b/MacaU/Search.docx
@@ -717,7 +717,13 @@
           <w:rPr>
             <w:rFonts w:ascii="Cambria Math" w:eastAsiaTheme="minorEastAsia" w:hAnsi="Cambria Math"/>
           </w:rPr>
-          <m:t>∈S</m:t>
+          <m:t>∈</m:t>
+        </m:r>
+        <m:r>
+          <w:rPr>
+            <w:rFonts w:ascii="Cambria Math" w:eastAsiaTheme="minorEastAsia" w:hAnsi="Cambria Math"/>
+          </w:rPr>
+          <m:t>S</m:t>
         </m:r>
       </m:oMath>
       <w:r>
@@ -2072,29 +2078,15 @@
           <w:lang w:val="en-US"/>
         </w:rPr>
       </w:pPr>
-      <w:proofErr w:type="gramStart"/>
-      <w:r>
-        <w:rPr>
-          <w:rFonts w:ascii="Consolas" w:hAnsi="Consolas"/>
-          <w:b/>
-          <w:bCs/>
-          <w:sz w:val="16"/>
-          <w:szCs w:val="16"/>
-          <w:lang w:val="en-US"/>
-        </w:rPr>
-        <w:t>[  0.0000</w:t>
-      </w:r>
-      <w:proofErr w:type="gramEnd"/>
-      <w:r>
-        <w:rPr>
-          <w:rFonts w:ascii="Consolas" w:hAnsi="Consolas"/>
-          <w:b/>
-          <w:bCs/>
-          <w:sz w:val="16"/>
-          <w:szCs w:val="16"/>
-          <w:lang w:val="en-US"/>
-        </w:rPr>
-        <w:t xml:space="preserve"> </w:t>
+      <w:r>
+        <w:rPr>
+          <w:rFonts w:ascii="Consolas" w:hAnsi="Consolas"/>
+          <w:b/>
+          <w:bCs/>
+          <w:sz w:val="16"/>
+          <w:szCs w:val="16"/>
+        </w:rPr>
+        <w:t xml:space="preserve">[  0.0000 </w:t>
       </w:r>
       <w:r>
         <w:rPr>
@@ -2114,7 +2106,6 @@
           <w:bCs/>
           <w:sz w:val="16"/>
           <w:szCs w:val="16"/>
-          <w:lang w:val="en-US"/>
         </w:rPr>
         <w:t>] [</w:t>
       </w:r>
@@ -2136,7 +2127,6 @@
           <w:bCs/>
           <w:sz w:val="16"/>
           <w:szCs w:val="16"/>
-          <w:lang w:val="en-US"/>
         </w:rPr>
         <w:t xml:space="preserve">] </w:t>
       </w:r>
@@ -2158,7 +2148,6 @@
           <w:bCs/>
           <w:sz w:val="16"/>
           <w:szCs w:val="16"/>
-          <w:lang w:val="en-US"/>
         </w:rPr>
         <w:t xml:space="preserve">: </w:t>
       </w:r>
@@ -2180,7 +2169,6 @@
           <w:bCs/>
           <w:sz w:val="16"/>
           <w:szCs w:val="16"/>
-          <w:lang w:val="en-US"/>
         </w:rPr>
         <w:t>=</w:t>
       </w:r>
@@ -2202,7 +2190,6 @@
           <w:bCs/>
           <w:sz w:val="16"/>
           <w:szCs w:val="16"/>
-          <w:lang w:val="en-US"/>
         </w:rPr>
         <w:t xml:space="preserve">, </w:t>
       </w:r>
@@ -2223,7 +2210,6 @@
           <w:bCs/>
           <w:sz w:val="16"/>
           <w:szCs w:val="16"/>
-          <w:lang w:val="en-US"/>
         </w:rPr>
         <w:t xml:space="preserve"> </w:t>
       </w:r>
@@ -2251,29 +2237,16 @@
           <w:lang w:val="en-US"/>
         </w:rPr>
       </w:pPr>
-      <w:proofErr w:type="gramStart"/>
-      <w:r>
-        <w:rPr>
-          <w:rFonts w:ascii="Consolas" w:hAnsi="Consolas"/>
-          <w:b/>
-          <w:bCs/>
-          <w:sz w:val="16"/>
-          <w:szCs w:val="16"/>
-          <w:lang w:val="en-US"/>
-        </w:rPr>
-        <w:t>[  1.1067</w:t>
-      </w:r>
-      <w:proofErr w:type="gramEnd"/>
-      <w:r>
-        <w:rPr>
-          <w:rFonts w:ascii="Consolas" w:hAnsi="Consolas"/>
-          <w:b/>
-          <w:bCs/>
-          <w:sz w:val="16"/>
-          <w:szCs w:val="16"/>
-          <w:lang w:val="en-US"/>
-        </w:rPr>
-        <w:t xml:space="preserve"> s] [B] MAC: received RTS </w:t>
+      <w:r>
+        <w:rPr>
+          <w:rFonts w:ascii="Consolas" w:hAnsi="Consolas"/>
+          <w:b/>
+          <w:bCs/>
+          <w:sz w:val="16"/>
+          <w:szCs w:val="16"/>
+          <w:lang w:val="en-US"/>
+        </w:rPr>
+        <w:t xml:space="preserve">[  1.1067 s] [B] MAC: received RTS </w:t>
       </w:r>
       <w:proofErr w:type="spellStart"/>
       <w:r>
@@ -2336,29 +2309,16 @@
           <w:lang w:val="en-US"/>
         </w:rPr>
       </w:pPr>
-      <w:proofErr w:type="gramStart"/>
-      <w:r>
-        <w:rPr>
-          <w:rFonts w:ascii="Consolas" w:hAnsi="Consolas"/>
-          <w:b/>
-          <w:bCs/>
-          <w:sz w:val="16"/>
-          <w:szCs w:val="16"/>
-          <w:lang w:val="en-US"/>
-        </w:rPr>
-        <w:t>[  2.2133</w:t>
-      </w:r>
-      <w:proofErr w:type="gramEnd"/>
-      <w:r>
-        <w:rPr>
-          <w:rFonts w:ascii="Consolas" w:hAnsi="Consolas"/>
-          <w:b/>
-          <w:bCs/>
-          <w:sz w:val="16"/>
-          <w:szCs w:val="16"/>
-          <w:lang w:val="en-US"/>
-        </w:rPr>
-        <w:t xml:space="preserve"> s] [A] MAC: </w:t>
+      <w:r>
+        <w:rPr>
+          <w:rFonts w:ascii="Consolas" w:hAnsi="Consolas"/>
+          <w:b/>
+          <w:bCs/>
+          <w:sz w:val="16"/>
+          <w:szCs w:val="16"/>
+          <w:lang w:val="en-US"/>
+        </w:rPr>
+        <w:t xml:space="preserve">[  2.2133 s] [A] MAC: </w:t>
       </w:r>
       <w:proofErr w:type="spellStart"/>
       <w:r>
@@ -2421,29 +2381,16 @@
           <w:lang w:val="en-US"/>
         </w:rPr>
       </w:pPr>
-      <w:proofErr w:type="gramStart"/>
-      <w:r>
-        <w:rPr>
-          <w:rFonts w:ascii="Consolas" w:hAnsi="Consolas"/>
-          <w:b/>
-          <w:bCs/>
-          <w:sz w:val="16"/>
-          <w:szCs w:val="16"/>
-          <w:lang w:val="en-US"/>
-        </w:rPr>
-        <w:t>[  2.2133</w:t>
-      </w:r>
-      <w:proofErr w:type="gramEnd"/>
-      <w:r>
-        <w:rPr>
-          <w:rFonts w:ascii="Consolas" w:hAnsi="Consolas"/>
-          <w:b/>
-          <w:bCs/>
-          <w:sz w:val="16"/>
-          <w:szCs w:val="16"/>
-          <w:lang w:val="en-US"/>
-        </w:rPr>
-        <w:t xml:space="preserve"> s] [A] MAC: state=WFACK, </w:t>
+      <w:r>
+        <w:rPr>
+          <w:rFonts w:ascii="Consolas" w:hAnsi="Consolas"/>
+          <w:b/>
+          <w:bCs/>
+          <w:sz w:val="16"/>
+          <w:szCs w:val="16"/>
+          <w:lang w:val="en-US"/>
+        </w:rPr>
+        <w:t xml:space="preserve">[  2.2133 s] [A] MAC: state=WFACK, </w:t>
       </w:r>
       <w:proofErr w:type="spellStart"/>
       <w:r>
@@ -2482,29 +2429,16 @@
           <w:lang w:val="en-US"/>
         </w:rPr>
       </w:pPr>
-      <w:proofErr w:type="gramStart"/>
-      <w:r>
-        <w:rPr>
-          <w:rFonts w:ascii="Consolas" w:hAnsi="Consolas"/>
-          <w:b/>
-          <w:bCs/>
-          <w:sz w:val="16"/>
-          <w:szCs w:val="16"/>
-          <w:lang w:val="en-US"/>
-        </w:rPr>
-        <w:t>[  4.9200</w:t>
-      </w:r>
-      <w:proofErr w:type="gramEnd"/>
-      <w:r>
-        <w:rPr>
-          <w:rFonts w:ascii="Consolas" w:hAnsi="Consolas"/>
-          <w:b/>
-          <w:bCs/>
-          <w:sz w:val="16"/>
-          <w:szCs w:val="16"/>
-          <w:lang w:val="en-US"/>
-        </w:rPr>
-        <w:t xml:space="preserve"> s] [B] MAC: received DATA seq=0, payload=</w:t>
+      <w:r>
+        <w:rPr>
+          <w:rFonts w:ascii="Consolas" w:hAnsi="Consolas"/>
+          <w:b/>
+          <w:bCs/>
+          <w:sz w:val="16"/>
+          <w:szCs w:val="16"/>
+          <w:lang w:val="en-US"/>
+        </w:rPr>
+        <w:t>[  4.9200 s] [B] MAC: received DATA seq=0, payload=</w:t>
       </w:r>
       <w:proofErr w:type="spellStart"/>
       <w:r>
@@ -2543,29 +2477,16 @@
           <w:lang w:val="en-US"/>
         </w:rPr>
       </w:pPr>
-      <w:proofErr w:type="gramStart"/>
-      <w:r>
-        <w:rPr>
-          <w:rFonts w:ascii="Consolas" w:hAnsi="Consolas"/>
-          <w:b/>
-          <w:bCs/>
-          <w:sz w:val="16"/>
-          <w:szCs w:val="16"/>
-          <w:lang w:val="en-US"/>
-        </w:rPr>
-        <w:t>[  4.9200</w:t>
-      </w:r>
-      <w:proofErr w:type="gramEnd"/>
-      <w:r>
-        <w:rPr>
-          <w:rFonts w:ascii="Consolas" w:hAnsi="Consolas"/>
-          <w:b/>
-          <w:bCs/>
-          <w:sz w:val="16"/>
-          <w:szCs w:val="16"/>
-          <w:lang w:val="en-US"/>
-        </w:rPr>
-        <w:t xml:space="preserve"> s] [B] APP: received seq=0, from=A payload=</w:t>
+      <w:r>
+        <w:rPr>
+          <w:rFonts w:ascii="Consolas" w:hAnsi="Consolas"/>
+          <w:b/>
+          <w:bCs/>
+          <w:sz w:val="16"/>
+          <w:szCs w:val="16"/>
+          <w:lang w:val="en-US"/>
+        </w:rPr>
+        <w:t>[  4.9200 s] [B] APP: received seq=0, from=A payload=</w:t>
       </w:r>
       <w:proofErr w:type="spellStart"/>
       <w:r>
@@ -2604,29 +2525,16 @@
           <w:lang w:val="en-US"/>
         </w:rPr>
       </w:pPr>
-      <w:proofErr w:type="gramStart"/>
-      <w:r>
-        <w:rPr>
-          <w:rFonts w:ascii="Consolas" w:hAnsi="Consolas"/>
-          <w:b/>
-          <w:bCs/>
-          <w:sz w:val="16"/>
-          <w:szCs w:val="16"/>
-          <w:lang w:val="en-US"/>
-        </w:rPr>
-        <w:t>[  4.9200</w:t>
-      </w:r>
-      <w:proofErr w:type="gramEnd"/>
-      <w:r>
-        <w:rPr>
-          <w:rFonts w:ascii="Consolas" w:hAnsi="Consolas"/>
-          <w:b/>
-          <w:bCs/>
-          <w:sz w:val="16"/>
-          <w:szCs w:val="16"/>
-          <w:lang w:val="en-US"/>
-        </w:rPr>
-        <w:t xml:space="preserve"> s] [B] MAC: </w:t>
+      <w:r>
+        <w:rPr>
+          <w:rFonts w:ascii="Consolas" w:hAnsi="Consolas"/>
+          <w:b/>
+          <w:bCs/>
+          <w:sz w:val="16"/>
+          <w:szCs w:val="16"/>
+          <w:lang w:val="en-US"/>
+        </w:rPr>
+        <w:t xml:space="preserve">[  4.9200 s] [B] MAC: </w:t>
       </w:r>
       <w:proofErr w:type="spellStart"/>
       <w:r>
@@ -2665,29 +2573,16 @@
           <w:lang w:val="en-US"/>
         </w:rPr>
       </w:pPr>
-      <w:proofErr w:type="gramStart"/>
-      <w:r>
-        <w:rPr>
-          <w:rFonts w:ascii="Consolas" w:hAnsi="Consolas"/>
-          <w:b/>
-          <w:bCs/>
-          <w:sz w:val="16"/>
-          <w:szCs w:val="16"/>
-          <w:lang w:val="en-US"/>
-        </w:rPr>
-        <w:t>[  6.0267</w:t>
-      </w:r>
-      <w:proofErr w:type="gramEnd"/>
-      <w:r>
-        <w:rPr>
-          <w:rFonts w:ascii="Consolas" w:hAnsi="Consolas"/>
-          <w:b/>
-          <w:bCs/>
-          <w:sz w:val="16"/>
-          <w:szCs w:val="16"/>
-          <w:lang w:val="en-US"/>
-        </w:rPr>
-        <w:t xml:space="preserve"> s] [A] MAC: received ACK seq=0</w:t>
+      <w:r>
+        <w:rPr>
+          <w:rFonts w:ascii="Consolas" w:hAnsi="Consolas"/>
+          <w:b/>
+          <w:bCs/>
+          <w:sz w:val="16"/>
+          <w:szCs w:val="16"/>
+          <w:lang w:val="en-US"/>
+        </w:rPr>
+        <w:t>[  6.0267 s] [A] MAC: received ACK seq=0</w:t>
       </w:r>
     </w:p>
     <w:p>
@@ -2701,27 +2596,15 @@
           <w:szCs w:val="16"/>
         </w:rPr>
       </w:pPr>
-      <w:proofErr w:type="gramStart"/>
-      <w:r>
-        <w:rPr>
-          <w:rFonts w:ascii="Consolas" w:hAnsi="Consolas"/>
-          <w:b/>
-          <w:bCs/>
-          <w:sz w:val="16"/>
-          <w:szCs w:val="16"/>
-        </w:rPr>
-        <w:t>[  6.0267</w:t>
-      </w:r>
-      <w:proofErr w:type="gramEnd"/>
-      <w:r>
-        <w:rPr>
-          <w:rFonts w:ascii="Consolas" w:hAnsi="Consolas"/>
-          <w:b/>
-          <w:bCs/>
-          <w:sz w:val="16"/>
-          <w:szCs w:val="16"/>
-        </w:rPr>
-        <w:t xml:space="preserve"> </w:t>
+      <w:r>
+        <w:rPr>
+          <w:rFonts w:ascii="Consolas" w:hAnsi="Consolas"/>
+          <w:b/>
+          <w:bCs/>
+          <w:sz w:val="16"/>
+          <w:szCs w:val="16"/>
+        </w:rPr>
+        <w:t xml:space="preserve">[  6.0267 </w:t>
       </w:r>
       <w:r>
         <w:rPr>
@@ -2820,29 +2703,16 @@
           <w:lang w:val="en-US"/>
         </w:rPr>
       </w:pPr>
-      <w:proofErr w:type="gramStart"/>
-      <w:r>
-        <w:rPr>
-          <w:rFonts w:ascii="Consolas" w:hAnsi="Consolas"/>
-          <w:b/>
-          <w:bCs/>
-          <w:sz w:val="16"/>
-          <w:szCs w:val="16"/>
-          <w:lang w:val="en-US"/>
-        </w:rPr>
-        <w:t>[  6.0267</w:t>
-      </w:r>
-      <w:proofErr w:type="gramEnd"/>
-      <w:r>
-        <w:rPr>
-          <w:rFonts w:ascii="Consolas" w:hAnsi="Consolas"/>
-          <w:b/>
-          <w:bCs/>
-          <w:sz w:val="16"/>
-          <w:szCs w:val="16"/>
-          <w:lang w:val="en-US"/>
-        </w:rPr>
-        <w:t xml:space="preserve"> s] [A] APP: s1 </w:t>
+      <w:r>
+        <w:rPr>
+          <w:rFonts w:ascii="Consolas" w:hAnsi="Consolas"/>
+          <w:b/>
+          <w:bCs/>
+          <w:sz w:val="16"/>
+          <w:szCs w:val="16"/>
+          <w:lang w:val="en-US"/>
+        </w:rPr>
+        <w:t xml:space="preserve">[  6.0267 s] [A] APP: s1 </w:t>
       </w:r>
       <w:proofErr w:type="spellStart"/>
       <w:r>
@@ -3148,20 +3018,20 @@
       </w:r>
     </w:p>
     <w:p>
+      <w:r>
+        <w:t>Время, затрачиваемое на передачу служебных пакетов</w:t>
+      </w:r>
+      <w:r>
+        <w:t xml:space="preserve"> в примере</w:t>
+      </w:r>
+      <w:r>
+        <w:t xml:space="preserve">, по формуле будет равно </w:t>
+      </w:r>
+    </w:p>
+    <w:p>
       <w:pPr>
-        <w:rPr>
-          <w:rFonts w:eastAsiaTheme="minorEastAsia"/>
-        </w:rPr>
+        <w:jc w:val="center"/>
       </w:pPr>
-      <w:r>
-        <w:t>Время, затрачиваемое на передачу служебных пакетов</w:t>
-      </w:r>
-      <w:r>
-        <w:t xml:space="preserve"> в примере</w:t>
-      </w:r>
-      <w:r>
-        <w:t xml:space="preserve">, по формуле будет равно </w:t>
-      </w:r>
       <m:oMath>
         <m:r>
           <w:rPr>
@@ -3180,12 +3050,22 @@
       <w:r>
         <w:t xml:space="preserve">. </w:t>
       </w:r>
+    </w:p>
+    <w:p>
       <w:r>
         <w:t>А д</w:t>
       </w:r>
       <w:r>
         <w:t xml:space="preserve">ля пакета с данными время равно </w:t>
       </w:r>
+    </w:p>
+    <w:p>
+      <w:pPr>
+        <w:jc w:val="center"/>
+        <w:rPr>
+          <w:rFonts w:eastAsiaTheme="minorEastAsia"/>
+        </w:rPr>
+      </w:pPr>
       <m:oMath>
         <m:r>
           <w:rPr>
@@ -3217,64 +3097,50 @@
         <w:rPr>
           <w:rFonts w:eastAsiaTheme="minorEastAsia"/>
         </w:rPr>
-        <w:t xml:space="preserve"> Тогда модель взаимодействия </w:t>
-      </w:r>
-      <w:r>
-        <w:rPr>
-          <w:rFonts w:eastAsiaTheme="minorEastAsia"/>
+        <w:t xml:space="preserve"> </w:t>
+      </w:r>
+    </w:p>
+    <w:p>
+      <w:r>
+        <w:t xml:space="preserve">Тогда модель взаимодействия </w:t>
+      </w:r>
+      <w:r>
+        <w:rPr>
           <w:lang w:val="en-US"/>
         </w:rPr>
         <w:t>RTS</w:t>
       </w:r>
       <w:r>
-        <w:rPr>
-          <w:rFonts w:eastAsiaTheme="minorEastAsia"/>
-        </w:rPr>
         <w:t xml:space="preserve"> -&gt; </w:t>
       </w:r>
       <w:r>
         <w:rPr>
-          <w:rFonts w:eastAsiaTheme="minorEastAsia"/>
           <w:lang w:val="en-US"/>
         </w:rPr>
         <w:t>CTS</w:t>
       </w:r>
       <w:r>
-        <w:rPr>
-          <w:rFonts w:eastAsiaTheme="minorEastAsia"/>
-        </w:rPr>
         <w:t xml:space="preserve"> -&gt; </w:t>
       </w:r>
       <w:r>
         <w:rPr>
-          <w:rFonts w:eastAsiaTheme="minorEastAsia"/>
           <w:lang w:val="en-US"/>
         </w:rPr>
         <w:t>DATA</w:t>
       </w:r>
       <w:r>
-        <w:rPr>
-          <w:rFonts w:eastAsiaTheme="minorEastAsia"/>
-        </w:rPr>
         <w:t xml:space="preserve"> -&gt; </w:t>
       </w:r>
       <w:r>
         <w:rPr>
-          <w:rFonts w:eastAsiaTheme="minorEastAsia"/>
           <w:lang w:val="en-US"/>
         </w:rPr>
         <w:t>ACK</w:t>
       </w:r>
       <w:r>
-        <w:rPr>
-          <w:rFonts w:eastAsiaTheme="minorEastAsia"/>
-        </w:rPr>
         <w:t xml:space="preserve"> </w:t>
       </w:r>
       <w:r>
-        <w:rPr>
-          <w:rFonts w:eastAsiaTheme="minorEastAsia"/>
-        </w:rPr>
         <w:t>будет соответствовать полученным результатам рис. 7:</w:t>
       </w:r>
     </w:p>
@@ -3362,14 +3228,48 @@
       <w:r>
         <w:t xml:space="preserve">Отдельные частные сценарии так же соответствуют ожидаемому поведению. В программе дополнительно ко времени ожидания добавляется маленькое значение </w:t>
       </w:r>
-      <w:r>
-        <w:rPr>
-          <w:lang w:val="en-US"/>
-        </w:rPr>
-        <w:t>e</w:t>
-      </w:r>
-      <w:r>
-        <w:t>, которая позволяет исключить ошибки, возникающие при моментальном переходе межу событиями. Это подчеркивает физический смысл модемов, которые затрачивает небольшую часть времени на исполнение того или иного кода, а также на переключения.</w:t>
+      <m:oMath>
+        <m:r>
+          <w:rPr>
+            <w:rFonts w:ascii="Cambria Math" w:hAnsi="Cambria Math"/>
+            <w:lang w:val="en-US"/>
+          </w:rPr>
+          <m:t>eps</m:t>
+        </m:r>
+      </m:oMath>
+      <w:r>
+        <w:t>, котор</w:t>
+      </w:r>
+      <w:r>
+        <w:t xml:space="preserve">ое </w:t>
+      </w:r>
+      <w:r>
+        <w:t>позволяет исключить ошибки, возникающие при моментальном переходе межу событиями. Это подчеркивает физический смысл модемов, которые затрачивает небольшую часть времени на исполнение того или иного кода, а также на переключения.</w:t>
+      </w:r>
+    </w:p>
+    <w:p>
+      <w:r>
+        <w:lastRenderedPageBreak/>
+        <w:t>Сейчас расстояние между абонентами фиксированное, все слышат всех. Однако, что в полной мере описать протокол общего доступа к середе, необходимо расширить функционал реагирования абонентов на входящие сообщение, чтобы исключить проблему скрытого и открытого терминала.</w:t>
+      </w:r>
+    </w:p>
+    <w:p>
+      <w:pPr>
+        <w:rPr>
+          <w:lang w:val="en-US"/>
+        </w:rPr>
+      </w:pPr>
+      <w:r>
+        <w:t xml:space="preserve">Для этого введем более гибкий параметр расстояния и параметр </w:t>
+      </w:r>
+      <w:r>
+        <w:rPr>
+          <w:lang w:val="en-US"/>
+        </w:rPr>
+        <w:t>NAV</w:t>
+      </w:r>
+      <w:r>
+        <w:t>, который определяет, как долго абонент должен находиться в состоянии отложенной передачи</w:t>
       </w:r>
     </w:p>
     <w:p>
@@ -3386,245 +3286,7 @@
         <w:t>.</w:t>
       </w:r>
     </w:p>
-    <w:p>
-      <w:pPr>
-        <w:rPr>
-          <w:lang w:val="en-US"/>
-        </w:rPr>
-      </w:pPr>
-      <w:r>
-        <w:rPr>
-          <w:lang w:val="en-US"/>
-        </w:rPr>
-        <w:t xml:space="preserve">    def s1():</w:t>
-      </w:r>
-    </w:p>
-    <w:p>
-      <w:pPr>
-        <w:rPr>
-          <w:lang w:val="en-US"/>
-        </w:rPr>
-      </w:pPr>
-      <w:r>
-        <w:rPr>
-          <w:lang w:val="en-US"/>
-        </w:rPr>
-        <w:lastRenderedPageBreak/>
-        <w:t xml:space="preserve">        ok = yield node_a.</w:t>
-      </w:r>
-      <w:proofErr w:type="gramStart"/>
-      <w:r>
-        <w:rPr>
-          <w:lang w:val="en-US"/>
-        </w:rPr>
-        <w:t>application.send</w:t>
-      </w:r>
-      <w:proofErr w:type="gramEnd"/>
-      <w:r>
-        <w:rPr>
-          <w:lang w:val="en-US"/>
-        </w:rPr>
-        <w:t>("B", b"Hello World! From node A")</w:t>
-      </w:r>
-    </w:p>
-    <w:p>
-      <w:pPr>
-        <w:rPr>
-          <w:lang w:val="en-US"/>
-        </w:rPr>
-      </w:pPr>
-      <w:r>
-        <w:rPr>
-          <w:lang w:val="en-US"/>
-        </w:rPr>
-        <w:t xml:space="preserve">        </w:t>
-      </w:r>
-      <w:proofErr w:type="gramStart"/>
-      <w:r>
-        <w:rPr>
-          <w:lang w:val="en-US"/>
-        </w:rPr>
-        <w:t>node_a.log(</w:t>
-      </w:r>
-      <w:proofErr w:type="gramEnd"/>
-      <w:r>
-        <w:rPr>
-          <w:lang w:val="en-US"/>
-        </w:rPr>
-        <w:t xml:space="preserve">f"APP: s1 </w:t>
-      </w:r>
-      <w:r>
-        <w:t>доставлено</w:t>
-      </w:r>
-      <w:r>
-        <w:rPr>
-          <w:lang w:val="en-US"/>
-        </w:rPr>
-        <w:t>={ok}")</w:t>
-      </w:r>
-    </w:p>
-    <w:p>
-      <w:pPr>
-        <w:rPr>
-          <w:lang w:val="en-US"/>
-        </w:rPr>
-      </w:pPr>
-    </w:p>
-    <w:p>
-      <w:pPr>
-        <w:rPr>
-          <w:lang w:val="en-US"/>
-        </w:rPr>
-      </w:pPr>
-      <w:r>
-        <w:rPr>
-          <w:lang w:val="en-US"/>
-        </w:rPr>
-        <w:t xml:space="preserve">    def s2():</w:t>
-      </w:r>
-    </w:p>
-    <w:p>
-      <w:pPr>
-        <w:rPr>
-          <w:lang w:val="en-US"/>
-        </w:rPr>
-      </w:pPr>
-      <w:r>
-        <w:rPr>
-          <w:lang w:val="en-US"/>
-        </w:rPr>
-        <w:t xml:space="preserve">        ok = yield node_b.</w:t>
-      </w:r>
-      <w:proofErr w:type="gramStart"/>
-      <w:r>
-        <w:rPr>
-          <w:lang w:val="en-US"/>
-        </w:rPr>
-        <w:t>application.send</w:t>
-      </w:r>
-      <w:proofErr w:type="gramEnd"/>
-      <w:r>
-        <w:rPr>
-          <w:lang w:val="en-US"/>
-        </w:rPr>
-        <w:t>("B", b"From process B")</w:t>
-      </w:r>
-    </w:p>
-    <w:p>
-      <w:pPr>
-        <w:rPr>
-          <w:lang w:val="en-US"/>
-        </w:rPr>
-      </w:pPr>
-      <w:r>
-        <w:rPr>
-          <w:lang w:val="en-US"/>
-        </w:rPr>
-        <w:t xml:space="preserve">        </w:t>
-      </w:r>
-      <w:proofErr w:type="gramStart"/>
-      <w:r>
-        <w:rPr>
-          <w:lang w:val="en-US"/>
-        </w:rPr>
-        <w:t>node_a.log(</w:t>
-      </w:r>
-      <w:proofErr w:type="gramEnd"/>
-      <w:r>
-        <w:rPr>
-          <w:lang w:val="en-US"/>
-        </w:rPr>
-        <w:t xml:space="preserve">f"APP: s2 </w:t>
-      </w:r>
-      <w:r>
-        <w:t>доставлено</w:t>
-      </w:r>
-      <w:r>
-        <w:rPr>
-          <w:lang w:val="en-US"/>
-        </w:rPr>
-        <w:t>={ok}")</w:t>
-      </w:r>
-    </w:p>
-    <w:p>
-      <w:pPr>
-        <w:rPr>
-          <w:lang w:val="en-US"/>
-        </w:rPr>
-      </w:pPr>
-    </w:p>
-    <w:p>
-      <w:pPr>
-        <w:rPr>
-          <w:lang w:val="en-US"/>
-        </w:rPr>
-      </w:pPr>
-      <w:r>
-        <w:rPr>
-          <w:lang w:val="en-US"/>
-        </w:rPr>
-        <w:t xml:space="preserve">    </w:t>
-      </w:r>
-      <w:proofErr w:type="gramStart"/>
-      <w:r>
-        <w:rPr>
-          <w:lang w:val="en-US"/>
-        </w:rPr>
-        <w:t>env.process</w:t>
-      </w:r>
-      <w:proofErr w:type="gramEnd"/>
-      <w:r>
-        <w:rPr>
-          <w:lang w:val="en-US"/>
-        </w:rPr>
-        <w:t>(s1())</w:t>
-      </w:r>
-    </w:p>
-    <w:p>
-      <w:pPr>
-        <w:rPr>
-          <w:lang w:val="en-US"/>
-        </w:rPr>
-      </w:pPr>
-      <w:r>
-        <w:rPr>
-          <w:lang w:val="en-US"/>
-        </w:rPr>
-        <w:t xml:space="preserve">    </w:t>
-      </w:r>
-      <w:proofErr w:type="gramStart"/>
-      <w:r>
-        <w:rPr>
-          <w:lang w:val="en-US"/>
-        </w:rPr>
-        <w:t>env.timeout</w:t>
-      </w:r>
-      <w:proofErr w:type="gramEnd"/>
-      <w:r>
-        <w:rPr>
-          <w:lang w:val="en-US"/>
-        </w:rPr>
-        <w:t>(1.1067)</w:t>
-      </w:r>
-    </w:p>
-    <w:p>
-      <w:r>
-        <w:rPr>
-          <w:lang w:val="en-US"/>
-        </w:rPr>
-        <w:t xml:space="preserve">    </w:t>
-      </w:r>
-      <w:proofErr w:type="spellStart"/>
-      <w:proofErr w:type="gramStart"/>
-      <w:r>
-        <w:t>env.process</w:t>
-      </w:r>
-      <w:proofErr w:type="spellEnd"/>
-      <w:proofErr w:type="gramEnd"/>
-      <w:r>
-        <w:t>(s2())</w:t>
-      </w:r>
-    </w:p>
+    <w:p/>
     <w:p/>
     <w:sectPr>
       <w:pgSz w:w="11906" w:h="16838"/>

</xml_diff>

<commit_message>
Now MAC take into the distatnce beetween subscribers. Added topology.py, which include functions of calculate distance and set/get distance between subscribers. Var distances is used everywhere (Chanel, Pysical, MAC). In future add positions for every subscrers and distance in neigboors in node.py which accumulate during working
</commit_message>
<xml_diff>
--- a/MacaU/Search.docx
+++ b/MacaU/Search.docx
@@ -565,7 +565,13 @@
     </w:p>
     <w:p>
       <w:r>
-        <w:t>Перейдем к конфигурации сети. Модемы, способные принимать сигнал одновременно с нескольких направлений, имеют слепые зоны и могут быть оптимально направлены на прием из одной плоскости. По этой причине в задаче рассматривается плоскостная конфигурация сети, которая в общем случае содержит три координаты в пространстве для каждого абонента, описывающие его положение</w:t>
+        <w:t xml:space="preserve">Перейдем к конфигурации сети. Модемы, способные принимать сигнал одновременно с нескольких направлений, имеют слепые зоны и могут быть оптимально направлены на прием из одной плоскости. По этой причине в задаче рассматривается плоскостная </w:t>
+      </w:r>
+      <w:r>
+        <w:t>топология</w:t>
+      </w:r>
+      <w:r>
+        <w:t xml:space="preserve"> сети, которая в общем случае содержит три координаты в пространстве для каждого абонента, описывающие его положение</w:t>
       </w:r>
     </w:p>
     <w:p>
@@ -717,13 +723,7 @@
           <w:rPr>
             <w:rFonts w:ascii="Cambria Math" w:eastAsiaTheme="minorEastAsia" w:hAnsi="Cambria Math"/>
           </w:rPr>
-          <m:t>∈</m:t>
-        </m:r>
-        <m:r>
-          <w:rPr>
-            <w:rFonts w:ascii="Cambria Math" w:eastAsiaTheme="minorEastAsia" w:hAnsi="Cambria Math"/>
-          </w:rPr>
-          <m:t>S</m:t>
+          <m:t>∈S</m:t>
         </m:r>
       </m:oMath>
       <w:r>
@@ -3250,17 +3250,95 @@
     <w:p>
       <w:r>
         <w:lastRenderedPageBreak/>
-        <w:t>Сейчас расстояние между абонентами фиксированное, все слышат всех. Однако, что в полной мере описать протокол общего доступа к середе, необходимо расширить функционал реагирования абонентов на входящие сообщение, чтобы исключить проблему скрытого и открытого терминала.</w:t>
-      </w:r>
-    </w:p>
-    <w:p>
-      <w:pPr>
-        <w:rPr>
-          <w:lang w:val="en-US"/>
-        </w:rPr>
-      </w:pPr>
-      <w:r>
-        <w:t xml:space="preserve">Для этого введем более гибкий параметр расстояния и параметр </w:t>
+        <w:t xml:space="preserve">В предыдущем эксперименте расстояние между абонентами было фиксированным и не требовало особого внимания, поскольку рассматривалось только два абонента. В задаче, когда расстояние между парами узлов не одинаковое, необходимо в </w:t>
+      </w:r>
+      <w:r>
+        <w:rPr>
+          <w:lang w:val="en-US"/>
+        </w:rPr>
+        <w:t>MAC</w:t>
+      </w:r>
+      <w:r>
+        <w:t xml:space="preserve"> протоколе учитывать это расстояние</w:t>
+      </w:r>
+      <w:r>
+        <w:t>, чтобы контроль доступа к среде был оптимальным. Поскольку передача пакетов происходит в конкретные узлы, отправитель знает о своем положении и о положении получателя. Эта информация сопутствует</w:t>
+      </w:r>
+      <w:r>
+        <w:t xml:space="preserve"> </w:t>
+      </w:r>
+      <w:r>
+        <w:t xml:space="preserve">использованию </w:t>
+      </w:r>
+      <w:r>
+        <w:t>адаптивно</w:t>
+      </w:r>
+      <w:r>
+        <w:t xml:space="preserve">го </w:t>
+      </w:r>
+      <w:r>
+        <w:t>контроля общего доступа.</w:t>
+      </w:r>
+    </w:p>
+    <w:p>
+      <w:r>
+        <w:t xml:space="preserve">Расстояние используется отправителем при расчете времени ожидания </w:t>
+      </w:r>
+      <w:r>
+        <w:rPr>
+          <w:lang w:val="en-US"/>
+        </w:rPr>
+        <w:t>CTS</w:t>
+      </w:r>
+      <w:r>
+        <w:t xml:space="preserve"> </w:t>
+      </w:r>
+      <w:r>
+        <w:t xml:space="preserve">и </w:t>
+      </w:r>
+      <w:r>
+        <w:rPr>
+          <w:lang w:val="en-US"/>
+        </w:rPr>
+        <w:t>ACK</w:t>
+      </w:r>
+      <w:r>
+        <w:t xml:space="preserve"> (</w:t>
+      </w:r>
+      <w:r>
+        <w:t>опционально</w:t>
+      </w:r>
+      <w:r>
+        <w:t>)</w:t>
+      </w:r>
+      <w:r>
+        <w:t xml:space="preserve">, а также при расчете времени ожидания получателя </w:t>
+      </w:r>
+      <w:r>
+        <w:rPr>
+          <w:lang w:val="en-US"/>
+        </w:rPr>
+        <w:t>DATA</w:t>
+      </w:r>
+      <w:r>
+        <w:t>.</w:t>
+      </w:r>
+    </w:p>
+    <w:p>
+      <w:r>
+        <w:t xml:space="preserve">Перейдем к задаче взаимодействия трех узлов, когда вероятность коллизий имеет существенное значение. </w:t>
+      </w:r>
+      <w:r>
+        <w:t xml:space="preserve">Необходимо в </w:t>
+      </w:r>
+      <w:r>
+        <w:rPr>
+          <w:lang w:val="en-US"/>
+        </w:rPr>
+        <w:t>MAC</w:t>
+      </w:r>
+      <w:r>
+        <w:t xml:space="preserve"> протокол добавить параметр </w:t>
       </w:r>
       <w:r>
         <w:rPr>
@@ -3269,23 +3347,115 @@
         <w:t>NAV</w:t>
       </w:r>
       <w:r>
-        <w:t>, который определяет, как долго абонент должен находиться в состоянии отложенной передачи</w:t>
-      </w:r>
-    </w:p>
-    <w:p>
-      <w:r>
-        <w:t xml:space="preserve">Перейдем к сценарию взаимодействия трех абонентов, чтобы оценить правильность написанного протокола </w:t>
-      </w:r>
-      <w:r>
-        <w:rPr>
-          <w:lang w:val="en-US"/>
-        </w:rPr>
-        <w:t>MACAU</w:t>
-      </w:r>
-      <w:r>
-        <w:t>.</w:t>
-      </w:r>
-    </w:p>
+        <w:t xml:space="preserve">, который будет откладывать передачи абонентами, если они создают конфликты. Значение </w:t>
+      </w:r>
+      <w:r>
+        <w:rPr>
+          <w:lang w:val="en-US"/>
+        </w:rPr>
+        <w:t>NAV</w:t>
+      </w:r>
+      <w:r>
+        <w:t xml:space="preserve"> – время, которое абонент должен молчать. </w:t>
+      </w:r>
+    </w:p>
+    <w:p>
+      <w:r>
+        <w:t xml:space="preserve">Место применение </w:t>
+      </w:r>
+      <w:r>
+        <w:rPr>
+          <w:lang w:val="en-US"/>
+        </w:rPr>
+        <w:t>NAV</w:t>
+      </w:r>
+      <w:r>
+        <w:t xml:space="preserve"> четко определено: когда узел в состоянии </w:t>
+      </w:r>
+      <w:r>
+        <w:rPr>
+          <w:lang w:val="en-US"/>
+        </w:rPr>
+        <w:t>IDLE</w:t>
+      </w:r>
+      <w:r>
+        <w:t xml:space="preserve"> услышал чужой </w:t>
+      </w:r>
+      <w:proofErr w:type="spellStart"/>
+      <w:r>
+        <w:rPr>
+          <w:lang w:val="en-US"/>
+        </w:rPr>
+        <w:t>RTSx</w:t>
+      </w:r>
+      <w:proofErr w:type="spellEnd"/>
+      <w:r>
+        <w:t>/</w:t>
+      </w:r>
+      <w:proofErr w:type="spellStart"/>
+      <w:r>
+        <w:rPr>
+          <w:lang w:val="en-US"/>
+        </w:rPr>
+        <w:t>CTSx</w:t>
+      </w:r>
+      <w:proofErr w:type="spellEnd"/>
+      <w:r>
+        <w:t>/</w:t>
+      </w:r>
+      <w:proofErr w:type="spellStart"/>
+      <w:r>
+        <w:rPr>
+          <w:lang w:val="en-US"/>
+        </w:rPr>
+        <w:t>DATAx</w:t>
+      </w:r>
+      <w:proofErr w:type="spellEnd"/>
+      <w:r>
+        <w:t xml:space="preserve"> </w:t>
+      </w:r>
+      <w:r>
+        <w:t>адресованные не ему, он должен замолчать</w:t>
+      </w:r>
+      <w:r>
+        <w:t>;</w:t>
+      </w:r>
+      <w:r>
+        <w:t xml:space="preserve"> если абонент принимает </w:t>
+      </w:r>
+      <w:proofErr w:type="spellStart"/>
+      <w:r>
+        <w:rPr>
+          <w:lang w:val="en-US"/>
+        </w:rPr>
+        <w:t>CTSx</w:t>
+      </w:r>
+      <w:proofErr w:type="spellEnd"/>
+      <w:r>
+        <w:t>/</w:t>
+      </w:r>
+      <w:proofErr w:type="spellStart"/>
+      <w:r>
+        <w:rPr>
+          <w:lang w:val="en-US"/>
+        </w:rPr>
+        <w:t>DATAx</w:t>
+      </w:r>
+      <w:proofErr w:type="spellEnd"/>
+      <w:r>
+        <w:t xml:space="preserve"> в состоянии </w:t>
+      </w:r>
+      <w:r>
+        <w:rPr>
+          <w:lang w:val="en-US"/>
+        </w:rPr>
+        <w:t>WFCTS</w:t>
+      </w:r>
+      <w:r>
+        <w:t>, он должен прервать свой цикл обмена, чтобы не помешать существующей передаче.</w:t>
+      </w:r>
+    </w:p>
+    <w:p/>
     <w:p/>
     <w:p/>
     <w:sectPr>

</xml_diff>